<commit_message>
docs: refresh presentation briefing evidence
</commit_message>
<xml_diff>
--- a/docs/briefing-thuyet-trinh-du-an-vi.docx
+++ b/docs/briefing-thuyet-trinh-du-an-vi.docx
@@ -392,7 +392,7 @@
                 <w:color w:val="1F2937"/>
                 <w:sz w:val="18"/>
               </w:rPr>
-              <w:t>29/06/2026: backend 119 tests pass; traceability gate pass; frontend lint/build pass.</w:t>
+              <w:t>20/07/2026: 12/12 feature COMPLETE và trace 100%; backend 916/916; frontend 152/152; lint/build và Playwright 4/4 pass.</w:t>
             </w:r>
           </w:p>
         </w:tc>
@@ -538,7 +538,7 @@
           <w:color w:val="1F2937"/>
           <w:sz w:val="22"/>
         </w:rPr>
-        <w:t>Tài liệu: Constitution và shared context đặt luật chung; mỗi feature có SPEC, PLAN, TASKS, TEST_PLAN.</w:t>
+        <w:t>Tài liệu: Constitution và shared context đặt luật chung; mỗi feature có CONTEXT, SPEC, PLAN, TASKS, TEST_PLAN và CHANGELOG.</w:t>
       </w:r>
     </w:p>
     <w:p>
@@ -637,7 +637,7 @@
                 <w:color w:val="1F2937"/>
                 <w:sz w:val="21"/>
               </w:rPr>
-              <w:t>Dự án của nhóm em là Library Management System cho SWP391. Mục tiêu là giảm xử lý thủ công trong thư viện: quản lý sách, từng bản sao sách, thành viên, mượn - trả, đặt chỗ, phí phạt, thông báo và báo cáo. Về kỹ thuật, dự án dùng backend Node.js Express, frontend React Bootstrap, database SQL Server và REST API. Điểm quan trọng là nhóm không làm theo kiểu code trước tài liệu sau, mà theo Hybrid SDD + ADD. Mỗi tính năng cốt lõi có SPEC.md làm nguồn sự thật; AI/agent chỉ hỗ trợ review, chia task, code và test dựa trên spec. Code phải trace về requirement bằng @spec, test phải map về acceptance criteria. Hiện tại repo có 12 feature Phase 1; 6 feature đã có traceability 100% và sẵn sàng review, backend test pass 119/119, frontend lint/build pass. Dự án chưa claim hoàn tất 100%; các phần chưa xong được ghi rõ trong TECH_DEBT.md.</w:t>
+              <w:t>Dự án của nhóm em là Library Management System cho SWP391. Mục tiêu là giảm xử lý thủ công trong thư viện: quản lý sách, từng bản sao sách, thành viên, mượn - trả, đặt chỗ, phí phạt, thông báo và báo cáo. Về kỹ thuật, dự án dùng backend Node.js Express, frontend React Bootstrap, database SQL Server và REST API. Điểm quan trọng là nhóm không làm theo kiểu code trước tài liệu sau, mà theo Hybrid SDD + ADD. Mỗi tính năng cốt lõi có SPEC.md làm nguồn sự thật; AI/agent chỉ hỗ trợ review, chia task, code và test dựa trên spec. Code phải trace về requirement bằng @spec, test phải map về acceptance criteria. Hiện tại cả 12 feature Phase 1 đã COMPLETE trong approved scope và đạt 100% FR traceability; backend pass 916/916 tests, frontend pass 152/152 tests, lint/build và Playwright 4/4 đều xanh. Các giới hạn tương lai vẫn được ghi rõ trong release documentation.</w:t>
             </w:r>
           </w:p>
         </w:tc>
@@ -660,7 +660,7 @@
           <w:color w:val="2E74B5"/>
           <w:sz w:val="32"/>
         </w:rPr>
-        <w:t>3. Ý chính từ sách SDD/ADD trong tmp/book</w:t>
+        <w:t>3. Ý chính từ playbook SDD/ADD</w:t>
       </w:r>
     </w:p>
     <w:p>
@@ -2924,7 +2924,7 @@
                 <w:color w:val="1F2937"/>
                 <w:sz w:val="16"/>
               </w:rPr>
-              <w:t>Spec approved; trace 0%, TASKS not started.</w:t>
+              <w:t>COMPLETE; trace 100%; accepted in approved Phase 1 scope.</w:t>
             </w:r>
           </w:p>
         </w:tc>
@@ -3034,7 +3034,7 @@
                 <w:color w:val="1F2937"/>
                 <w:sz w:val="16"/>
               </w:rPr>
-              <w:t>Ready for review; trace 100%; có tests.</w:t>
+              <w:t>COMPLETE; trace 100%; accepted in approved Phase 1 scope.</w:t>
             </w:r>
           </w:p>
         </w:tc>
@@ -3144,7 +3144,7 @@
                 <w:color w:val="1F2937"/>
                 <w:sz w:val="16"/>
               </w:rPr>
-              <w:t>Spec approved nhưng TASKS draft; trace 0%.</w:t>
+              <w:t>COMPLETE; trace 100%; accepted in approved Phase 1 scope.</w:t>
             </w:r>
           </w:p>
         </w:tc>
@@ -3254,7 +3254,7 @@
                 <w:color w:val="1F2937"/>
                 <w:sz w:val="16"/>
               </w:rPr>
-              <w:t>Spec approved; not started.</w:t>
+              <w:t>COMPLETE; trace 100%; accepted in approved Phase 1 scope.</w:t>
             </w:r>
           </w:p>
         </w:tc>
@@ -3364,7 +3364,7 @@
                 <w:color w:val="1F2937"/>
                 <w:sz w:val="16"/>
               </w:rPr>
-              <w:t>Spec approved; route có nhưng trace 0%, cần reconcile prototype.</w:t>
+              <w:t>COMPLETE; trace 100%; accepted in approved Phase 1 scope.</w:t>
             </w:r>
           </w:p>
         </w:tc>
@@ -3474,7 +3474,7 @@
                 <w:color w:val="1F2937"/>
                 <w:sz w:val="16"/>
               </w:rPr>
-              <w:t>Full spec approved; deferred/not started.</w:t>
+              <w:t>COMPLETE; trace 100%; accepted in approved Phase 1 scope.</w:t>
             </w:r>
           </w:p>
         </w:tc>
@@ -3584,7 +3584,7 @@
                 <w:color w:val="1F2937"/>
                 <w:sz w:val="16"/>
               </w:rPr>
-              <w:t>Ready for review; trace 100%; có route/integration tests.</w:t>
+              <w:t>COMPLETE; trace 100%; accepted in approved Phase 1 scope.</w:t>
             </w:r>
           </w:p>
         </w:tc>
@@ -3694,7 +3694,7 @@
                 <w:color w:val="1F2937"/>
                 <w:sz w:val="16"/>
               </w:rPr>
-              <w:t>Ready for review; trace 100%; có tests.</w:t>
+              <w:t>COMPLETE; trace 100%; accepted in approved Phase 1 scope.</w:t>
             </w:r>
           </w:p>
         </w:tc>
@@ -3804,7 +3804,7 @@
                 <w:color w:val="1F2937"/>
                 <w:sz w:val="16"/>
               </w:rPr>
-              <w:t>Ready for review; trace 100%; backend done, UI còn debt.</w:t>
+              <w:t>COMPLETE for approved server scope; trace 100%; legacy React UI is non-authoritative release evidence.</w:t>
             </w:r>
           </w:p>
         </w:tc>
@@ -3914,7 +3914,7 @@
                 <w:color w:val="1F2937"/>
                 <w:sz w:val="16"/>
               </w:rPr>
-              <w:t>Ready for review; trace 100%; có tests.</w:t>
+              <w:t>COMPLETE for approved backend scope; trace 100%; notification inbox UI remains deferred.</w:t>
             </w:r>
           </w:p>
         </w:tc>
@@ -4024,7 +4024,7 @@
                 <w:color w:val="1F2937"/>
                 <w:sz w:val="16"/>
               </w:rPr>
-              <w:t>Spec approved; route có, trace 0%, còn P1 debt.</w:t>
+              <w:t>COMPLETE; trace 100%; accepted in approved Phase 1 scope.</w:t>
             </w:r>
           </w:p>
         </w:tc>
@@ -4134,7 +4134,7 @@
                 <w:color w:val="1F2937"/>
                 <w:sz w:val="16"/>
               </w:rPr>
-              <w:t>Ready for review; trace 100%; có tests.</w:t>
+              <w:t>COMPLETE; trace 100%; accepted in approved Phase 1 scope.</w:t>
             </w:r>
           </w:p>
         </w:tc>
@@ -4164,6 +4164,10 @@
       <w:pPr>
         <w:pStyle w:val="ListNumber"/>
         <w:spacing w:after="80" w:line="300" w:lineRule="auto"/>
+        <w:numPr>
+          <w:ilvl w:val="0"/>
+          <w:numId w:val="10"/>
+        </w:numPr>
       </w:pPr>
       <w:r>
         <w:rPr>
@@ -4180,6 +4184,10 @@
       <w:pPr>
         <w:pStyle w:val="ListNumber"/>
         <w:spacing w:after="80" w:line="300" w:lineRule="auto"/>
+        <w:numPr>
+          <w:ilvl w:val="0"/>
+          <w:numId w:val="10"/>
+        </w:numPr>
       </w:pPr>
       <w:r>
         <w:rPr>
@@ -4196,6 +4204,10 @@
       <w:pPr>
         <w:pStyle w:val="ListNumber"/>
         <w:spacing w:after="80" w:line="300" w:lineRule="auto"/>
+        <w:numPr>
+          <w:ilvl w:val="0"/>
+          <w:numId w:val="10"/>
+        </w:numPr>
       </w:pPr>
       <w:r>
         <w:rPr>
@@ -4212,6 +4224,10 @@
       <w:pPr>
         <w:pStyle w:val="ListNumber"/>
         <w:spacing w:after="80" w:line="300" w:lineRule="auto"/>
+        <w:numPr>
+          <w:ilvl w:val="0"/>
+          <w:numId w:val="10"/>
+        </w:numPr>
       </w:pPr>
       <w:r>
         <w:rPr>
@@ -4228,6 +4244,10 @@
       <w:pPr>
         <w:pStyle w:val="ListNumber"/>
         <w:spacing w:after="80" w:line="300" w:lineRule="auto"/>
+        <w:numPr>
+          <w:ilvl w:val="0"/>
+          <w:numId w:val="10"/>
+        </w:numPr>
       </w:pPr>
       <w:r>
         <w:rPr>
@@ -4244,6 +4264,10 @@
       <w:pPr>
         <w:pStyle w:val="ListNumber"/>
         <w:spacing w:after="80" w:line="300" w:lineRule="auto"/>
+        <w:numPr>
+          <w:ilvl w:val="0"/>
+          <w:numId w:val="10"/>
+        </w:numPr>
       </w:pPr>
       <w:r>
         <w:rPr>
@@ -4260,6 +4284,10 @@
       <w:pPr>
         <w:pStyle w:val="ListNumber"/>
         <w:spacing w:after="80" w:line="300" w:lineRule="auto"/>
+        <w:numPr>
+          <w:ilvl w:val="0"/>
+          <w:numId w:val="10"/>
+        </w:numPr>
       </w:pPr>
       <w:r>
         <w:rPr>
@@ -4276,6 +4304,10 @@
       <w:pPr>
         <w:pStyle w:val="ListNumber"/>
         <w:spacing w:after="80" w:line="300" w:lineRule="auto"/>
+        <w:numPr>
+          <w:ilvl w:val="0"/>
+          <w:numId w:val="10"/>
+        </w:numPr>
       </w:pPr>
       <w:r>
         <w:rPr>
@@ -5524,7 +5556,7 @@
           <w:color w:val="1F2937"/>
           <w:sz w:val="22"/>
         </w:rPr>
-        <w:t>Kết quả đã chạy lại trên máy ngày 29/06/2026:</w:t>
+        <w:t>Kết quả closeout được xác nhận ngày 20/07/2026:</w:t>
       </w:r>
     </w:p>
     <w:tbl>
@@ -5650,7 +5682,7 @@
                 <w:color w:val="1F2937"/>
                 <w:sz w:val="17"/>
               </w:rPr>
-              <w:t>npm.cmd --prefix backend test</w:t>
+              <w:t>npm.cmd --prefix backend run test:coverage:ci</w:t>
             </w:r>
           </w:p>
         </w:tc>
@@ -5677,7 +5709,7 @@
                 <w:color w:val="1F2937"/>
                 <w:sz w:val="17"/>
               </w:rPr>
-              <w:t>14 suites pass, 119 tests pass</w:t>
+              <w:t>PASS; 53 suites, 916/916 tests</w:t>
             </w:r>
           </w:p>
         </w:tc>
@@ -5704,7 +5736,7 @@
                 <w:color w:val="1F2937"/>
                 <w:sz w:val="17"/>
               </w:rPr>
-              <w:t>Backend regression hiện tại xanh.</w:t>
+              <w:t>Backend regression và coverage gate hiện tại xanh.</w:t>
             </w:r>
           </w:p>
         </w:tc>
@@ -5760,7 +5792,7 @@
                 <w:color w:val="1F2937"/>
                 <w:sz w:val="17"/>
               </w:rPr>
-              <w:t>PASS; 6 implemented features, 0 below 70%</w:t>
+              <w:t>PASS; 12/12 features, 100% FR coverage</w:t>
             </w:r>
           </w:p>
         </w:tc>
@@ -5787,7 +5819,7 @@
                 <w:color w:val="1F2937"/>
                 <w:sz w:val="17"/>
               </w:rPr>
-              <w:t>FR được tag @spec trong source cho feature implemented.</w:t>
+              <w:t>Mọi approved Phase 1 feature đều COMPLETE và trace về SPEC.</w:t>
             </w:r>
           </w:p>
         </w:tc>
@@ -5816,7 +5848,7 @@
                 <w:color w:val="1F2937"/>
                 <w:sz w:val="17"/>
               </w:rPr>
-              <w:t>npm.cmd --prefix frontend run lint</w:t>
+              <w:t>npm.cmd --prefix frontend test</w:t>
             </w:r>
           </w:p>
         </w:tc>
@@ -5843,7 +5875,7 @@
                 <w:color w:val="1F2937"/>
                 <w:sz w:val="17"/>
               </w:rPr>
-              <w:t>PASS</w:t>
+              <w:t>PASS; 152/152 tests</w:t>
             </w:r>
           </w:p>
         </w:tc>
@@ -5870,7 +5902,7 @@
                 <w:color w:val="1F2937"/>
                 <w:sz w:val="17"/>
               </w:rPr>
-              <w:t>Frontend không có lỗi ESLint hiện tại.</w:t>
+              <w:t>Frontend regression hiện tại xanh.</w:t>
             </w:r>
           </w:p>
         </w:tc>
@@ -5899,7 +5931,7 @@
                 <w:color w:val="1F2937"/>
                 <w:sz w:val="17"/>
               </w:rPr>
-              <w:t>npm.cmd --prefix frontend run build</w:t>
+              <w:t>npm.cmd --prefix frontend run lint &amp;&amp; npm.cmd --prefix frontend run build</w:t>
             </w:r>
           </w:p>
         </w:tc>
@@ -5926,7 +5958,7 @@
                 <w:color w:val="1F2937"/>
                 <w:sz w:val="17"/>
               </w:rPr>
-              <w:t>PASS; warning chunk &gt;500kB</w:t>
+              <w:t>PASS; lint sạch, build 57 assets, entry 320.688 bytes</w:t>
             </w:r>
           </w:p>
         </w:tc>
@@ -5953,7 +5985,7 @@
                 <w:color w:val="1F2937"/>
                 <w:sz w:val="17"/>
               </w:rPr>
-              <w:t>Build được; cần tối ưu bundle sau.</w:t>
+              <w:t>Frontend quality/build gate pass; tổng byte còn là tối ưu tương lai.</w:t>
             </w:r>
           </w:p>
         </w:tc>
@@ -6480,7 +6512,7 @@
                 <w:color w:val="1F2937"/>
                 <w:sz w:val="21"/>
               </w:rPr>
-              <w:t>Không nói 'dự án xong hết'. Nói: Phase 1 đã có spec đầy đủ và một phần core đã implemented/traced. Các phần chưa xong được ghi thành technical debt, có ID, ưu tiên và hướng xử lý.</w:t>
+              <w:t>Không nói 'mọi phạm vi tương lai đều xong'. Nói: approved FE01-FE12 Phase 1 scope đã COMPLETE, traceability 100% và post-merge CI pass. Các giới hạn ngoài scope vẫn được ghi rõ trong release documentation.</w:t>
             </w:r>
           </w:p>
         </w:tc>
@@ -6585,7 +6617,7 @@
                 <w:color w:val="1F2937"/>
                 <w:sz w:val="18"/>
               </w:rPr>
-              <w:t>FE06 Inventory deferred</w:t>
+              <w:t>FE09 legacy frontend</w:t>
             </w:r>
           </w:p>
         </w:tc>
@@ -6612,7 +6644,7 @@
                 <w:color w:val="1F2937"/>
                 <w:sz w:val="18"/>
               </w:rPr>
-              <w:t>Đây là core artifact, cần route/controller/service/repo/test riêng; hiện có model/schema nên chưa claim done.</w:t>
+              <w:t>Release evidence uses the canonical server API; legacy React local records are non-authoritative for acceptance.</w:t>
             </w:r>
           </w:p>
         </w:tc>
@@ -6641,7 +6673,7 @@
                 <w:color w:val="1F2937"/>
                 <w:sz w:val="18"/>
               </w:rPr>
-              <w:t>FE11 User &amp; Role debt</w:t>
+              <w:t>FE10 inbox UI</w:t>
             </w:r>
           </w:p>
         </w:tc>
@@ -6668,7 +6700,7 @@
                 <w:color w:val="1F2937"/>
                 <w:sz w:val="18"/>
               </w:rPr>
-              <w:t>Có route/RBAC fix, nhưng còn validate librarian fields, role error behavior, 404, service-level tests.</w:t>
+              <w:t>Notification inbox UI remains outside the completed Phase 1 scope; backend delivery, retry, audit, and SMTP staging evidence are complete.</w:t>
             </w:r>
           </w:p>
         </w:tc>
@@ -6697,7 +6729,7 @@
                 <w:color w:val="1F2937"/>
                 <w:sz w:val="18"/>
               </w:rPr>
-              <w:t>FE09 frontend align</w:t>
+              <w:t>Shared SQL CI</w:t>
             </w:r>
           </w:p>
         </w:tc>
@@ -6724,7 +6756,7 @@
                 <w:color w:val="1F2937"/>
                 <w:sz w:val="18"/>
               </w:rPr>
-              <w:t>Backend fine server-side đã có, UI FineManagement cần migrate sang API mới.</w:t>
+              <w:t>SQL-backed tests pass locally; CI still lacks a shared disposable SQL Server service.</w:t>
             </w:r>
           </w:p>
         </w:tc>
@@ -6753,7 +6785,7 @@
                 <w:color w:val="1F2937"/>
                 <w:sz w:val="18"/>
               </w:rPr>
-              <w:t>FE02 follow-up</w:t>
+              <w:t>Durable avatar storage</w:t>
             </w:r>
           </w:p>
         </w:tc>
@@ -6780,7 +6812,7 @@
                 <w:color w:val="1F2937"/>
                 <w:sz w:val="18"/>
               </w:rPr>
-              <w:t>Cần thêm API tests duplicate email/weak password và clarify IP rate limit/login inactive message.</w:t>
+              <w:t>Avatar upload works in approved scope; production-scale staging needs durable storage.</w:t>
             </w:r>
           </w:p>
         </w:tc>
@@ -6809,7 +6841,7 @@
                 <w:color w:val="1F2937"/>
                 <w:sz w:val="18"/>
               </w:rPr>
-              <w:t>E2E/SQL Server CI</w:t>
+              <w:t>Production SLA</w:t>
             </w:r>
           </w:p>
         </w:tc>
@@ -6836,7 +6868,7 @@
                 <w:color w:val="1F2937"/>
                 <w:sz w:val="18"/>
               </w:rPr>
-              <w:t>Có API-level integration, nhưng chưa có browser E2E và SQL Server-backed CI do infra.</w:t>
+              <w:t>Azure staging is a student-credit environment; no production SLA claim is made.</w:t>
             </w:r>
           </w:p>
         </w:tc>
@@ -7375,7 +7407,7 @@
                 <w:color w:val="1F2937"/>
                 <w:sz w:val="17"/>
               </w:rPr>
-              <w:t>Có. Hiện tại backend 119 tests pass, trace gate pass, frontend lint/build pass. Nhưng còn gap E2E/browser và SQL Server CI.</w:t>
+              <w:t>Có. Backend 916/916, frontend 152/152, traceability 12/12 feature ở 100%, lint/build và Playwright 4/4 pass. Shared disposable SQL CI, inbox UI, durable avatar storage và production SLA vẫn là giới hạn ngoài scope.</w:t>
             </w:r>
           </w:p>
         </w:tc>
@@ -8105,7 +8137,7 @@
                 <w:color w:val="1F2937"/>
                 <w:sz w:val="17"/>
               </w:rPr>
-              <w:t>119 tests pass, trace gate pass, frontend lint/build pass, CI workflow.</w:t>
+              <w:t>Backend 916/916, frontend 152/152, trace 12/12 ở 100%, lint/build, Playwright 4/4 và CI pass.</w:t>
             </w:r>
           </w:p>
         </w:tc>
@@ -8161,7 +8193,7 @@
                 <w:color w:val="1F2937"/>
                 <w:sz w:val="17"/>
               </w:rPr>
-              <w:t>Hạn chế và debt</w:t>
+              <w:t>Hạn chế ngoài scope</w:t>
             </w:r>
           </w:p>
         </w:tc>
@@ -8188,7 +8220,7 @@
                 <w:color w:val="1F2937"/>
                 <w:sz w:val="17"/>
               </w:rPr>
-              <w:t>Không claim done hết; nếu còn gap thì đã track trong TECH_DEBT.</w:t>
+              <w:t>FE09 legacy UI, FE10 inbox UI, shared SQL CI, durable avatar storage và production SLA được ghi rõ.</w:t>
             </w:r>
           </w:p>
         </w:tc>
@@ -8978,7 +9010,7 @@
                 <w:color w:val="1F2937"/>
                 <w:sz w:val="17"/>
               </w:rPr>
-              <w:t>tmp/book/p109-p115, p127-p151, p174-p180, p319-p340, p358-p374</w:t>
+              <w:t>Playbook SDD/ADD bản PDF tham chiếu local: trang 109-115, 127-151, 174-180, 319-340, 358-374.</w:t>
             </w:r>
           </w:p>
         </w:tc>
@@ -9017,7 +9049,7 @@
           <w:color w:val="1F2937"/>
           <w:sz w:val="22"/>
         </w:rPr>
-        <w:t>Mở sẵn repo ở D:\SWP391\library-management-system.</w:t>
+        <w:t>Mở sẵn repository Library Management System.</w:t>
       </w:r>
     </w:p>
     <w:p>
@@ -9065,7 +9097,7 @@
           <w:color w:val="1F2937"/>
           <w:sz w:val="22"/>
         </w:rPr>
-        <w:t>Nhớ 4 con số: 5 bản sao, 14 ngày, 5.000 VND/ngày, 119 tests pass.</w:t>
+        <w:t>Nhớ các số chính: 5 bản sao, 14 ngày, 5.000 VND/ngày/bản sao, 12/12 feature trace 100%, backend 916/916 và frontend 152/152 tests pass.</w:t>
       </w:r>
     </w:p>
     <w:p>
@@ -9202,7 +9234,7 @@
         <w:color w:val="5F6B7A"/>
         <w:sz w:val="17"/>
       </w:rPr>
-      <w:t>Nguồn: .sdd, tmp/book, backend, frontend, database | Cập nhật 29/06/2026</w:t>
+      <w:t>Nguồn: .sdd, Playbook SDD/ADD, backend, frontend, database | Cập nhật 20/07/2026</w:t>
     </w:r>
   </w:p>
 </w:ftr>
@@ -9428,6 +9460,12 @@
   </w:num>
   <w:num w:numId="9">
     <w:abstractNumId w:val="0"/>
+  </w:num>
+  <w:num w:numId="10">
+    <w:abstractNumId w:val="7"/>
+    <w:lvlOverride w:ilvl="0">
+      <w:startOverride w:val="1"/>
+    </w:lvlOverride>
   </w:num>
 </w:numbering>
 </file>

</xml_diff>